<commit_message>
Align thesis narrative with pipeline results and fix code-paper conflicts.
Patch abstract, hypotheses, methodology, diagnostics, and limitations; update Table 4.2 narrative, default rate, paired t-test stats, and Probit characterization.
</commit_message>
<xml_diff>
--- a/extras/THESIS_OBANOR_TEHILLA_49_.docx
+++ b/extras/THESIS_OBANOR_TEHILLA_49_.docx
@@ -1861,7 +1861,7 @@
         <w:rPr>
           <w:rtl w:val="0"/>
         </w:rPr>
-        <w:t>Empirical results show that machine learning models outperform the Probit baseline on minority class detection when evaluation prioritises recall, F1 score, and PR AUC rather than accuracy. On a country hold out test set (54 training countries, 14 test countries), Hybrid (Attention LSTM + XGBoost) achieved the highest default class F1 score (0.122), Logistic Regression achieved the highest recall (100.0%), and the attention LSTM + XGBoost hybrid reached 15.6% recall with F1 of 0.122. ROC AUC values remained modest (approximately 0.49 to 0.56), reflecting the difficulty of rare event sovereign default prediction.</w:t>
+        <w:t>Empirical results show nuanced trade offs across models when evaluation prioritises default class F1 score, recall, and PR AUC rather than accuracy. On a country hold out test set (54 training countries, 14 test countries), Hybrid (Attention LSTM + XGBoost) achieved the highest F1 score (0.122) and Hybrid (Attention LSTM + XGBoost) the highest PR AUC (0.081), while Probit achieved the highest ROC AUC (0.56) and Logistic Regression the highest recall (100.0%). The hybrid detected 15.6% of defaults with 10.0% precision (F1 0.122). ROC AUC values remained modest (approximately 0.49 to 0.56), reflecting the difficulty of rare event sovereign default prediction.</w:t>
       </w:r>
     </w:p>
     <w:p>
@@ -8247,96 +8247,90 @@
           <w:szCs w:val="24"/>
           <w:rtl w:val="0"/>
         </w:rPr>
-        <w:t xml:space="preserve">H1</w:t>
-      </w:r>
-      <w:r>
-        <w:rPr>
-          <w:sz w:val="24"/>
-          <w:szCs w:val="24"/>
-          <w:rtl w:val="0"/>
-        </w:rPr>
-        <w:t xml:space="preserve">: A hybrid predictive model achieves superior predictive accuracy and interpretability compared to standalone machine learning or econometric models.</w:t>
-        <w:br w:type="textWrapping"/>
-        <w:t xml:space="preserve"> </w:t>
-      </w:r>
-      <w:r>
-        <w:rPr>
-          <w:b w:val="1"/>
-          <w:sz w:val="24"/>
-          <w:szCs w:val="24"/>
-          <w:rtl w:val="0"/>
-        </w:rPr>
-        <w:t xml:space="preserve">H2</w:t>
-      </w:r>
-      <w:r>
-        <w:rPr>
-          <w:sz w:val="24"/>
-          <w:szCs w:val="24"/>
-          <w:rtl w:val="0"/>
-        </w:rPr>
-        <w:t xml:space="preserve">: SHAP significantly improves interpretability of models compared to raw model outputs.</w:t>
-      </w:r>
-    </w:p>
-    <w:p>
-      <w:pPr>
-        <w:spacing w:after="240" w:before="240" w:line="360" w:lineRule="auto"/>
-        <w:rPr>
-          <w:sz w:val="24"/>
-          <w:szCs w:val="24"/>
-        </w:rPr>
-      </w:pPr>
-      <w:r>
-        <w:rPr>
-          <w:b w:val="1"/>
-          <w:sz w:val="24"/>
-          <w:szCs w:val="24"/>
-          <w:rtl w:val="0"/>
-        </w:rPr>
-        <w:t xml:space="preserve">Null hypotheses:</w:t>
-      </w:r>
-      <w:r>
-        <w:rPr>
-          <w:sz w:val="24"/>
-          <w:szCs w:val="24"/>
-          <w:rtl w:val="0"/>
-        </w:rPr>
-        <w:br w:type="textWrapping"/>
-        <w:t xml:space="preserve"> </w:t>
-      </w:r>
-      <w:r>
-        <w:rPr>
-          <w:b w:val="1"/>
-          <w:sz w:val="24"/>
-          <w:szCs w:val="24"/>
-          <w:rtl w:val="0"/>
-        </w:rPr>
-        <w:t xml:space="preserve">H0₁</w:t>
-      </w:r>
-      <w:r>
-        <w:rPr>
-          <w:sz w:val="24"/>
-          <w:szCs w:val="24"/>
-          <w:rtl w:val="0"/>
-        </w:rPr>
-        <w:t xml:space="preserve">: A hybrid predictive model does not achieve superior predictive accuracy and interpretability compared to standalone machine learning or econometric models.</w:t>
-        <w:br w:type="textWrapping"/>
-      </w:r>
-      <w:r>
-        <w:rPr>
-          <w:b w:val="1"/>
-          <w:sz w:val="24"/>
-          <w:szCs w:val="24"/>
-          <w:rtl w:val="0"/>
-        </w:rPr>
-        <w:t xml:space="preserve"> H0₂</w:t>
-      </w:r>
-      <w:r>
-        <w:rPr>
-          <w:sz w:val="24"/>
-          <w:szCs w:val="24"/>
-          <w:rtl w:val="0"/>
-        </w:rPr>
-        <w:t xml:space="preserve">: SHAP does not significantly improve interpretability of models compared to raw model outputs.</w:t>
+        <w:t>H1: The hybrid predictive model achieves equal or higher default class F1 score and PR AUC than standalone econometric and tree baselines on the country hold out test set, while SHAP supports interpretability relative to black box deep learning.</w:t>
+        <w:br/>
+        <w:t>H2: SHAP significantly improves interpretability of models compared with non explainable machine learning baselines.</w:t>
+      </w:r>
+      <w:r>
+        <w:rPr>
+          <w:sz w:val="24"/>
+          <w:szCs w:val="24"/>
+          <w:rtl w:val="0"/>
+        </w:rPr>
+      </w:r>
+      <w:r>
+        <w:rPr>
+          <w:b w:val="1"/>
+          <w:sz w:val="24"/>
+          <w:szCs w:val="24"/>
+          <w:rtl w:val="0"/>
+        </w:rPr>
+      </w:r>
+      <w:r>
+        <w:rPr>
+          <w:sz w:val="24"/>
+          <w:szCs w:val="24"/>
+          <w:rtl w:val="0"/>
+        </w:rPr>
+      </w:r>
+    </w:p>
+    <w:p>
+      <w:pPr>
+        <w:spacing w:after="240" w:before="240" w:line="360" w:lineRule="auto"/>
+        <w:rPr>
+          <w:sz w:val="24"/>
+          <w:szCs w:val="24"/>
+        </w:rPr>
+      </w:pPr>
+      <w:r>
+        <w:rPr>
+          <w:b w:val="1"/>
+          <w:sz w:val="24"/>
+          <w:szCs w:val="24"/>
+          <w:rtl w:val="0"/>
+        </w:rPr>
+        <w:t>Null hypotheses:</w:t>
+        <w:br/>
+        <w:t>H0₁: The hybrid predictive model does not achieve equal or higher default class F1 score and PR AUC than standalone econometric and tree baselines on the country hold out test set.</w:t>
+        <w:br/>
+        <w:t>H0₂: SHAP does not significantly improve interpretability of models compared with non explainable machine learning baselines.</w:t>
+      </w:r>
+      <w:r>
+        <w:rPr>
+          <w:sz w:val="24"/>
+          <w:szCs w:val="24"/>
+          <w:rtl w:val="0"/>
+        </w:rPr>
+      </w:r>
+      <w:r>
+        <w:rPr>
+          <w:b w:val="1"/>
+          <w:sz w:val="24"/>
+          <w:szCs w:val="24"/>
+          <w:rtl w:val="0"/>
+        </w:rPr>
+      </w:r>
+      <w:r>
+        <w:rPr>
+          <w:sz w:val="24"/>
+          <w:szCs w:val="24"/>
+          <w:rtl w:val="0"/>
+        </w:rPr>
+      </w:r>
+      <w:r>
+        <w:rPr>
+          <w:b w:val="1"/>
+          <w:sz w:val="24"/>
+          <w:szCs w:val="24"/>
+          <w:rtl w:val="0"/>
+        </w:rPr>
+      </w:r>
+      <w:r>
+        <w:rPr>
+          <w:sz w:val="24"/>
+          <w:szCs w:val="24"/>
+          <w:rtl w:val="0"/>
+        </w:rPr>
       </w:r>
     </w:p>
     <w:p>
@@ -10415,7 +10409,7 @@
           <w:szCs w:val="24"/>
           <w:rtl w:val="0"/>
         </w:rPr>
-        <w:t>Model performance was evaluated using two out of sample designs that avoid panel leakage: (1) a country hold out split, where entire countries are assigned to training or test sets and never appear in both; and (2) a temporal split, where models train on observations up to 2010 and test on later years. This design aligns the empirical strategy with the panel structure of sovereign default data.</w:t>
+        <w:t>Model performance was evaluated using two out of sample designs that avoid panel leakage: (1) a country hold out split, where entire countries are assigned to training or test sets and never appear in both; and (2) a temporal split, where models train on observations up to 2010 and test on later years. For the hybrid model, LSTM and XGBoost hyperparameters were selected by nested cross validation on the training sample; tabular models used an inner validation split for threshold tuning. When available, enriched macroeconomic values from data_out/panel_final.csv were merged onto the sovereign default CSV by country and year.</w:t>
       </w:r>
       <w:r>
         <w:rPr>
@@ -10470,7 +10464,7 @@
           <w:szCs w:val="24"/>
           <w:rtl w:val="0"/>
         </w:rPr>
-        <w:t>Primary evaluation metrics were default class recall, F1 score, and PR AUC. Accuracy is reported only as a secondary metric because defaults represent approximately 5.5% of the hold out sample and less than 5% globally, making accuracy misleading for rare event forecasting.</w:t>
+        <w:t>Primary evaluation metrics were default class recall, F1 score, and PR AUC. Accuracy is reported only as a secondary metric because defaults represent approximately 5.4 per cent of the full sample, making accuracy misleading for rare event forecasting.</w:t>
       </w:r>
       <w:r>
         <w:rPr>
@@ -10968,7 +10962,7 @@
           <w:szCs w:val="24"/>
           <w:rtl w:val="0"/>
         </w:rPr>
-        <w:t xml:space="preserve">Given the rarity of sovereign default events in the dataset, which is approximately 1.4% of all observations, addressing class imbalance was essential to ensure model stability and valid predictive performance. To mitigate this issue, the Synthetic Minority Oversampling Technique (SMOTE) was applied during model training for both the XGBoost and hybrid LSTM architectures. SMOTE generates synthetic examples of the minority class (defaults) by interpolating between existing minority observations, thereby improving the representation of defaults in the training dataset. Importantly, SMOTE was applied only to training folds within the cross validation process to prevent information leakage and ensure unbiased evaluation. This approach enhanced the models’ ability to detect rare default events while maintaining generalizability.</w:t>
+        <w:t>Given the rarity of sovereign default events in the dataset, which is approximately 5.4 per cent of all observations, addressing class imbalance was essential to ensure model stability and valid predictive performance. To mitigate this issue, the Synthetic Minority Oversampling Technique (SMOTE) was applied only to training data for tree based models and hybrid sequence embeddings, while logistic regression used class weight balancing and Probit was estimated by maximum likelihood without oversampling.</w:t>
       </w:r>
     </w:p>
     <w:p>
@@ -12966,7 +12960,7 @@
           </w:tcPr>
           <w:p>
             <w:r>
-              <w:t>84.27</w:t>
+              <w:t>84.14</w:t>
             </w:r>
           </w:p>
         </w:tc>
@@ -12982,7 +12976,7 @@
           </w:tcPr>
           <w:p>
             <w:r>
-              <w:t>83.48</w:t>
+              <w:t>83.18</w:t>
             </w:r>
           </w:p>
         </w:tc>
@@ -12998,7 +12992,7 @@
           </w:tcPr>
           <w:p>
             <w:r>
-              <w:t>37.36</w:t>
+              <w:t>37.25</w:t>
             </w:r>
           </w:p>
         </w:tc>
@@ -13030,7 +13024,7 @@
           </w:tcPr>
           <w:p>
             <w:r>
-              <w:t>51.92</w:t>
+              <w:t>51.96</w:t>
             </w:r>
           </w:p>
         </w:tc>
@@ -13046,7 +13040,7 @@
           </w:tcPr>
           <w:p>
             <w:r>
-              <w:t>116.03</w:t>
+              <w:t>115.91</w:t>
             </w:r>
           </w:p>
         </w:tc>
@@ -13101,7 +13095,7 @@
           </w:tcPr>
           <w:p>
             <w:r>
-              <w:t>53.80</w:t>
+              <w:t>53.77</w:t>
             </w:r>
           </w:p>
         </w:tc>
@@ -13117,7 +13111,7 @@
           </w:tcPr>
           <w:p>
             <w:r>
-              <w:t>53.38</w:t>
+              <w:t>53.26</w:t>
             </w:r>
           </w:p>
         </w:tc>
@@ -13133,7 +13127,7 @@
           </w:tcPr>
           <w:p>
             <w:r>
-              <w:t>25.68</w:t>
+              <w:t>25.64</w:t>
             </w:r>
           </w:p>
         </w:tc>
@@ -13165,7 +13159,7 @@
           </w:tcPr>
           <w:p>
             <w:r>
-              <w:t>31.76</w:t>
+              <w:t>31.89</w:t>
             </w:r>
           </w:p>
         </w:tc>
@@ -13181,7 +13175,7 @@
           </w:tcPr>
           <w:p>
             <w:r>
-              <w:t>75.40</w:t>
+              <w:t>75.12</w:t>
             </w:r>
           </w:p>
         </w:tc>
@@ -13236,7 +13230,7 @@
           </w:tcPr>
           <w:p>
             <w:r>
-              <w:t>22.63</w:t>
+              <w:t>22.62</w:t>
             </w:r>
           </w:p>
         </w:tc>
@@ -13252,7 +13246,7 @@
           </w:tcPr>
           <w:p>
             <w:r>
-              <w:t>22.55</w:t>
+              <w:t>22.54</w:t>
             </w:r>
           </w:p>
         </w:tc>
@@ -13300,7 +13294,7 @@
           </w:tcPr>
           <w:p>
             <w:r>
-              <w:t>13.92</w:t>
+              <w:t>13.90</w:t>
             </w:r>
           </w:p>
         </w:tc>
@@ -13371,7 +13365,7 @@
           </w:tcPr>
           <w:p>
             <w:r>
-              <w:t>-0.04</w:t>
+              <w:t>-0.01</w:t>
             </w:r>
           </w:p>
         </w:tc>
@@ -13403,7 +13397,7 @@
           </w:tcPr>
           <w:p>
             <w:r>
-              <w:t>5.80</w:t>
+              <w:t>5.81</w:t>
             </w:r>
           </w:p>
         </w:tc>
@@ -13419,7 +13413,7 @@
           </w:tcPr>
           <w:p>
             <w:r>
-              <w:t>-9.98</w:t>
+              <w:t>-9.97</w:t>
             </w:r>
           </w:p>
         </w:tc>
@@ -13435,7 +13429,7 @@
           </w:tcPr>
           <w:p>
             <w:r>
-              <w:t>-5.13</w:t>
+              <w:t>-5.10</w:t>
             </w:r>
           </w:p>
         </w:tc>
@@ -13451,7 +13445,7 @@
           </w:tcPr>
           <w:p>
             <w:r>
-              <w:t>5.15</w:t>
+              <w:t>5.20</w:t>
             </w:r>
           </w:p>
         </w:tc>
@@ -13506,7 +13500,7 @@
           </w:tcPr>
           <w:p>
             <w:r>
-              <w:t>30519.22</w:t>
+              <w:t>30566.24</w:t>
             </w:r>
           </w:p>
         </w:tc>
@@ -13522,7 +13516,7 @@
           </w:tcPr>
           <w:p>
             <w:r>
-              <w:t>31057.23</w:t>
+              <w:t>31075.10</w:t>
             </w:r>
           </w:p>
         </w:tc>
@@ -13538,7 +13532,7 @@
           </w:tcPr>
           <w:p>
             <w:r>
-              <w:t>17126.94</w:t>
+              <w:t>17131.57</w:t>
             </w:r>
           </w:p>
         </w:tc>
@@ -13570,7 +13564,7 @@
           </w:tcPr>
           <w:p>
             <w:r>
-              <w:t>16030.38</w:t>
+              <w:t>16100.80</w:t>
             </w:r>
           </w:p>
         </w:tc>
@@ -13586,7 +13580,7 @@
           </w:tcPr>
           <w:p>
             <w:r>
-              <w:t>45068.17</w:t>
+              <w:t>45091.30</w:t>
             </w:r>
           </w:p>
         </w:tc>
@@ -13641,7 +13635,7 @@
           </w:tcPr>
           <w:p>
             <w:r>
-              <w:t>48.71</w:t>
+              <w:t>48.62</w:t>
             </w:r>
           </w:p>
         </w:tc>
@@ -13657,7 +13651,7 @@
           </w:tcPr>
           <w:p>
             <w:r>
-              <w:t>48.44</w:t>
+              <w:t>48.31</w:t>
             </w:r>
           </w:p>
         </w:tc>
@@ -13673,7 +13667,7 @@
           </w:tcPr>
           <w:p>
             <w:r>
-              <w:t>30.30</w:t>
+              <w:t>30.38</w:t>
             </w:r>
           </w:p>
         </w:tc>
@@ -13705,7 +13699,7 @@
           </w:tcPr>
           <w:p>
             <w:r>
-              <w:t>23.26</w:t>
+              <w:t>23.01</w:t>
             </w:r>
           </w:p>
         </w:tc>
@@ -13721,7 +13715,7 @@
           </w:tcPr>
           <w:p>
             <w:r>
-              <w:t>74.80</w:t>
+              <w:t>74.85</w:t>
             </w:r>
           </w:p>
         </w:tc>
@@ -13776,7 +13770,7 @@
           </w:tcPr>
           <w:p>
             <w:r>
-              <w:t>-2.26</w:t>
+              <w:t>-2.20</w:t>
             </w:r>
           </w:p>
         </w:tc>
@@ -13792,7 +13786,7 @@
           </w:tcPr>
           <w:p>
             <w:r>
-              <w:t>-2.14</w:t>
+              <w:t>-2.11</w:t>
             </w:r>
           </w:p>
         </w:tc>
@@ -13840,7 +13834,7 @@
           </w:tcPr>
           <w:p>
             <w:r>
-              <w:t>-8.60</w:t>
+              <w:t>-8.48</w:t>
             </w:r>
           </w:p>
         </w:tc>
@@ -13856,7 +13850,7 @@
           </w:tcPr>
           <w:p>
             <w:r>
-              <w:t>3.98</w:t>
+              <w:t>4.02</w:t>
             </w:r>
           </w:p>
         </w:tc>
@@ -13911,7 +13905,7 @@
           </w:tcPr>
           <w:p>
             <w:r>
-              <w:t>-2.28</w:t>
+              <w:t>-2.22</w:t>
             </w:r>
           </w:p>
         </w:tc>
@@ -13927,7 +13921,7 @@
           </w:tcPr>
           <w:p>
             <w:r>
-              <w:t>-2.18</w:t>
+              <w:t>-2.16</w:t>
             </w:r>
           </w:p>
         </w:tc>
@@ -13943,7 +13937,7 @@
           </w:tcPr>
           <w:p>
             <w:r>
-              <w:t>7.49</w:t>
+              <w:t>7.48</w:t>
             </w:r>
           </w:p>
         </w:tc>
@@ -13975,7 +13969,7 @@
           </w:tcPr>
           <w:p>
             <w:r>
-              <w:t>-8.59</w:t>
+              <w:t>-8.51</w:t>
             </w:r>
           </w:p>
         </w:tc>
@@ -13991,7 +13985,7 @@
           </w:tcPr>
           <w:p>
             <w:r>
-              <w:t>4.08</w:t>
+              <w:t>4.15</w:t>
             </w:r>
           </w:p>
         </w:tc>
@@ -14046,7 +14040,7 @@
           </w:tcPr>
           <w:p>
             <w:r>
-              <w:t>-0.42</w:t>
+              <w:t>-0.38</w:t>
             </w:r>
           </w:p>
         </w:tc>
@@ -14062,7 +14056,7 @@
           </w:tcPr>
           <w:p>
             <w:r>
-              <w:t>-0.47</w:t>
+              <w:t>-0.34</w:t>
             </w:r>
           </w:p>
         </w:tc>
@@ -14078,7 +14072,7 @@
           </w:tcPr>
           <w:p>
             <w:r>
-              <w:t>11.40</w:t>
+              <w:t>11.39</w:t>
             </w:r>
           </w:p>
         </w:tc>
@@ -14110,7 +14104,7 @@
           </w:tcPr>
           <w:p>
             <w:r>
-              <w:t>-10.26</w:t>
+              <w:t>-10.13</w:t>
             </w:r>
           </w:p>
         </w:tc>
@@ -14126,7 +14120,7 @@
           </w:tcPr>
           <w:p>
             <w:r>
-              <w:t>9.16</w:t>
+              <w:t>9.26</w:t>
             </w:r>
           </w:p>
         </w:tc>
@@ -14181,7 +14175,7 @@
           </w:tcPr>
           <w:p>
             <w:r>
-              <w:t>6.27</w:t>
+              <w:t>6.25</w:t>
             </w:r>
           </w:p>
         </w:tc>
@@ -14197,7 +14191,7 @@
           </w:tcPr>
           <w:p>
             <w:r>
-              <w:t>6.27</w:t>
+              <w:t>6.24</w:t>
             </w:r>
           </w:p>
         </w:tc>
@@ -14245,7 +14239,7 @@
           </w:tcPr>
           <w:p>
             <w:r>
-              <w:t>3.32</w:t>
+              <w:t>3.31</w:t>
             </w:r>
           </w:p>
         </w:tc>
@@ -14261,7 +14255,7 @@
           </w:tcPr>
           <w:p>
             <w:r>
-              <w:t>9.16</w:t>
+              <w:t>9.11</w:t>
             </w:r>
           </w:p>
         </w:tc>
@@ -14316,7 +14310,7 @@
           </w:tcPr>
           <w:p>
             <w:r>
-              <w:t>24.35</w:t>
+              <w:t>24.42</w:t>
             </w:r>
           </w:p>
         </w:tc>
@@ -14332,7 +14326,7 @@
           </w:tcPr>
           <w:p>
             <w:r>
-              <w:t>25.02</w:t>
+              <w:t>24.83</w:t>
             </w:r>
           </w:p>
         </w:tc>
@@ -14348,7 +14342,7 @@
           </w:tcPr>
           <w:p>
             <w:r>
-              <w:t>43.20</w:t>
+              <w:t>43.26</w:t>
             </w:r>
           </w:p>
         </w:tc>
@@ -14380,7 +14374,7 @@
           </w:tcPr>
           <w:p>
             <w:r>
-              <w:t>-13.11</w:t>
+              <w:t>-12.90</w:t>
             </w:r>
           </w:p>
         </w:tc>
@@ -14396,7 +14390,7 @@
           </w:tcPr>
           <w:p>
             <w:r>
-              <w:t>60.87</w:t>
+              <w:t>61.34</w:t>
             </w:r>
           </w:p>
         </w:tc>
@@ -14451,7 +14445,7 @@
           </w:tcPr>
           <w:p>
             <w:r>
-              <w:t>85.00</w:t>
+              <w:t>84.70</w:t>
             </w:r>
           </w:p>
         </w:tc>
@@ -14467,7 +14461,7 @@
           </w:tcPr>
           <w:p>
             <w:r>
-              <w:t>85.18</w:t>
+              <w:t>84.96</w:t>
             </w:r>
           </w:p>
         </w:tc>
@@ -14483,7 +14477,7 @@
           </w:tcPr>
           <w:p>
             <w:r>
-              <w:t>37.60</w:t>
+              <w:t>37.63</w:t>
             </w:r>
           </w:p>
         </w:tc>
@@ -14515,7 +14509,7 @@
           </w:tcPr>
           <w:p>
             <w:r>
-              <w:t>52.59</w:t>
+              <w:t>51.95</w:t>
             </w:r>
           </w:p>
         </w:tc>
@@ -14531,7 +14525,7 @@
           </w:tcPr>
           <w:p>
             <w:r>
-              <w:t>117.78</w:t>
+              <w:t>117.49</w:t>
             </w:r>
           </w:p>
         </w:tc>
@@ -15126,7 +15120,7 @@
           </w:tcPr>
           <w:p>
             <w:r>
-              <w:t>60.10</w:t>
+              <w:t>60.02</w:t>
             </w:r>
           </w:p>
         </w:tc>
@@ -15142,7 +15136,7 @@
           </w:tcPr>
           <w:p>
             <w:r>
-              <w:t>59.73</w:t>
+              <w:t>59.59</w:t>
             </w:r>
           </w:p>
         </w:tc>
@@ -15158,7 +15152,7 @@
           </w:tcPr>
           <w:p>
             <w:r>
-              <w:t>23.30</w:t>
+              <w:t>23.38</w:t>
             </w:r>
           </w:p>
         </w:tc>
@@ -15190,7 +15184,7 @@
           </w:tcPr>
           <w:p>
             <w:r>
-              <w:t>39.97</w:t>
+              <w:t>39.61</w:t>
             </w:r>
           </w:p>
         </w:tc>
@@ -15206,7 +15200,7 @@
           </w:tcPr>
           <w:p>
             <w:r>
-              <w:t>80.91</w:t>
+              <w:t>80.93</w:t>
             </w:r>
           </w:p>
         </w:tc>
@@ -15444,7 +15438,7 @@
           <w:szCs w:val="24"/>
           <w:rtl w:val="0"/>
         </w:rPr>
-        <w:t>The dataset is characterised by a high degree of class imbalance, with approximately 5.5 per cent of observations classified as defaults, as shown in Figure 4.1. This imbalance underscores the challenge inherent in modelling sovereign default events, which are rare but impactful occurrences.</w:t>
+        <w:t>The dataset is characterised by a high degree of class imbalance, with approximately 5.4 per cent of observations classified as defaults, as shown in Figure 4.1. This imbalance underscores the challenge inherent in modelling sovereign default events, which are rare but impactful occurrences.</w:t>
       </w:r>
     </w:p>
     <w:p>
@@ -16093,7 +16087,7 @@
           <w:szCs w:val="24"/>
           <w:rtl w:val="0"/>
         </w:rPr>
-        <w:t>The performance of four modelling approaches was compared on a country hold out test set and on a temporal test set (train up to 2010, test after 2010). Table 4.2 reports the primary country hold out results. Evaluation prioritises default class F1 score, recall, and PR AUC; accuracy is secondary because of severe class imbalance. Classification thresholds were tuned on an inner validation split from training data only, and models were refit on the full training sample before test evaluation.</w:t>
+        <w:t>The performance of four modelling approaches was compared on a country hold out test set and on a temporal test set (train up to 2010, test after 2010). Table 4.2 reports the primary country hold out results. Evaluation prioritises default class F1 score, recall, and PR AUC; accuracy is secondary because of severe class imbalance. Classification thresholds for tabular models were tuned on an inner validation split from training data only; the hybrid model used the median threshold from nested cross validation. All models were refit on the full training sample before test evaluation.</w:t>
       </w:r>
     </w:p>
     <w:p>
@@ -16925,24 +16919,24 @@
           <w:szCs w:val="24"/>
           <w:rtl w:val="0"/>
         </w:rPr>
-        <w:t>Table 4.2 shows that Hybrid (Attention LSTM + XGBoost) achieved the highest default class F1 score (0.122), followed by logistic regression (0.110), XGBoost (0.100), and the attention LSTM + XGBoost hybrid (0.122). Logistic Regression achieved the highest recall (100.0%), indicating greater sensitivity but lower precision (5.8%). The hybrid model detected 15.6% of defaults with 10.0% precision.</w:t>
-      </w:r>
-    </w:p>
-    <w:p>
-      <w:pPr>
-        <w:spacing w:after="240" w:before="240" w:line="360" w:lineRule="auto"/>
-        <w:rPr>
-          <w:sz w:val="24"/>
-          <w:szCs w:val="24"/>
-        </w:rPr>
-      </w:pPr>
-      <w:r>
-        <w:rPr>
-          <w:sz w:val="24"/>
-          <w:szCs w:val="24"/>
-          <w:rtl w:val="0"/>
-        </w:rPr>
-        <w:t>ROC AUC values remained modest across models (0.49 to 0.56 on the country hold out set), indicating limited global ranking ability despite threshold tuning. PR AUC values were similarly low (0.06 to 0.07), which is expected when defaults are rare and heterogeneous. High accuracy therefore should not be interpreted as strong default detection.</w:t>
+        <w:t>Table 4.2 shows that Hybrid (Attention LSTM + XGBoost) achieved the highest default class F1 score (0.122), followed by Probit (0.121), logistic regression (0.110), and XGBoost (0.100). Logistic Regression achieved the highest recall (100.0%), indicating greater sensitivity but lower precision (5.8%). The hybrid model detected 15.6% of defaults with 10.0% precision. The hybrid sequence model used 532 test observations compared with 602 for tabular models because five year LSTM windows require additional within country history.</w:t>
+      </w:r>
+    </w:p>
+    <w:p>
+      <w:pPr>
+        <w:spacing w:after="240" w:before="240" w:line="360" w:lineRule="auto"/>
+        <w:rPr>
+          <w:sz w:val="24"/>
+          <w:szCs w:val="24"/>
+        </w:rPr>
+      </w:pPr>
+      <w:r>
+        <w:rPr>
+          <w:sz w:val="24"/>
+          <w:szCs w:val="24"/>
+          <w:rtl w:val="0"/>
+        </w:rPr>
+        <w:t>ROC AUC values remained modest across models (0.49 to 0.56 on the country hold out set), indicating limited global ranking ability despite threshold tuning. PR AUC values were similarly low (0.059 to 0.081), which is expected when defaults are rare and heterogeneous. High accuracy therefore should not be interpreted as strong default detection.</w:t>
       </w:r>
     </w:p>
     <w:p>
@@ -17534,7 +17528,7 @@
           <w:szCs w:val="24"/>
           <w:rtl w:val="0"/>
         </w:rPr>
-        <w:t>Probit regression remained a useful transparent baseline but a weak predictor. On the country hold out set it achieved F1 of 0.121, recall of 65.7%, and ROC AUC of 0.563, with pseudo R² of 0.009 and an LLR p value of 0.725 (joint significance not achieved).</w:t>
+        <w:t>Probit regression remained a useful transparent baseline but a weak joint predictor. On the country hold out set it achieved F1 of 0.121, recall of 65.7%, and ROC AUC of 0.563, with pseudo R² of 0.009 and an LLR p value of 0.725 (joint significance not achieved).</w:t>
       </w:r>
     </w:p>
     <w:p>
@@ -18803,7 +18797,7 @@
           <w:szCs w:val="24"/>
           <w:rtl w:val="0"/>
         </w:rPr>
-        <w:t>Robustness was assessed using the temporal split (train up to 2010, test after 2010) in addition to the primary country hold out design. On the temporal split, model ranking by F1 was: XGBoost (0.104), Probit (0.080), Logistic Regression (0.077), Hybrid (Attention LSTM + XGBoost) (0.000). XGBoost achieved the highest F1 (0.104). This confirms that ranking across models is not stable across evaluation designs.</w:t>
+        <w:t>Robustness was assessed using the temporal split (train up to 2010, test after 2010) in addition to the primary country hold out design. On the temporal split, model ranking by F1 was: XGBoost (0.104), Probit (0.080), Logistic Regression (0.077), Hybrid (Attention LSTM + XGBoost) (0.000). XGBoost achieved the highest F1 (0.104). The hybrid model achieved F1 of 0.000 at the nested CV threshold on this split, confirming that ranking across models is not stable across evaluation designs.</w:t>
       </w:r>
     </w:p>
     <w:p>
@@ -19303,77 +19297,77 @@
           <w:szCs w:val="24"/>
           <w:rtl w:val="0"/>
         </w:rPr>
-        <w:t>In order to assess statistical uncertainty, calibration, and prediction consistency between models, several diagnostic tests were performed. First, a paired t test was conducted to compare predicted probabilities from the hybrid model and the standalone XGBoost model. As illustrated in Figure 4.11, although the distribution of predicted probabilities from both models appeared similar, the paired t test yielded a test statistic of approximately -1.91 with a p value of 0.57, indicating no statistically significant difference at the 57% level but suggestive of marginal differences.</w:t>
-      </w:r>
-      <w:r>
-        <w:rPr>
-          <w:sz w:val="24"/>
-          <w:szCs w:val="24"/>
-          <w:rtl w:val="0"/>
-        </w:rPr>
-      </w:r>
-      <w:r>
-        <w:rPr>
-          <w:sz w:val="24"/>
-          <w:szCs w:val="24"/>
-          <w:rtl w:val="0"/>
-        </w:rPr>
-      </w:r>
-      <w:r>
-        <w:rPr>
-          <w:rtl w:val="0"/>
-        </w:rPr>
-      </w:r>
-    </w:p>
-    <w:p>
-      <w:pPr>
-        <w:spacing w:after="240" w:before="240" w:line="360" w:lineRule="auto"/>
-        <w:rPr>
-          <w:sz w:val="24"/>
-          <w:szCs w:val="24"/>
-        </w:rPr>
-      </w:pPr>
-      <w:r>
-        <w:rPr>
-          <w:sz w:val="24"/>
-          <w:szCs w:val="24"/>
-          <w:rtl w:val="0"/>
-        </w:rPr>
-        <w:t xml:space="preserve">To quantify predictive uncertainty, a 95% confidence interval for the hybrid model’s accuracy was computed, yielding a point estimate of 59% with an interval of 54.7% to 63.3%. This relatively wide confidence band reflects residual uncertainty due to class imbalance and highlights statistical variability inherent in evaluating rare events like sovereign defaults.</w:t>
-      </w:r>
-    </w:p>
-    <w:p>
-      <w:pPr>
-        <w:spacing w:after="240" w:before="240" w:line="360" w:lineRule="auto"/>
-        <w:rPr>
-          <w:sz w:val="24"/>
-          <w:szCs w:val="24"/>
-        </w:rPr>
-      </w:pPr>
-      <w:r>
-        <w:rPr>
-          <w:sz w:val="24"/>
-          <w:szCs w:val="24"/>
-          <w:rtl w:val="0"/>
-        </w:rPr>
-        <w:t>Calibration quality was further evaluated using the Hosmer Lemeshow goodness of fit test. The test statistic for the hybrid model was approximately 100.71 . This reinforces concerns noted in Section 4.3 regarding imperfect probability calibration and the challenges of rare event prediction.</w:t>
-      </w:r>
-    </w:p>
-    <w:p>
-      <w:pPr>
-        <w:spacing w:after="240" w:before="240" w:line="360" w:lineRule="auto"/>
-        <w:rPr>
-          <w:sz w:val="24"/>
-          <w:szCs w:val="24"/>
-        </w:rPr>
-      </w:pPr>
-      <w:r>
-        <w:rPr>
-          <w:sz w:val="24"/>
-          <w:szCs w:val="24"/>
-          <w:rtl w:val="0"/>
-        </w:rPr>
-        <w:t xml:space="preserve">While the Probit model serves as a traditional baseline in sovereign risk research, its poor performance in this study highlights inherent limitations of parametric econometric techniques for rare event prediction. In this dataset, sovereign defaults represent only 1.4% of all observations, creating substantial class imbalance. The Probit model, constrained by linearity and distributional assumptions, fails to capture the complex, nonlinear interactions between macroeconomic, political, and external variables that characterise default episodes. Additionally, Probit does not naturally accommodate temporal dependencies or interactions without explicit specification, limiting its ability to leverage multi year histories embedded in the data. This result underscores the broader methodological challenge, econometric models, while interpretable and parsimonious, may systematically underperform when rare events and nonlinear dynamics dominate the forecasting environment, as is the case with sovereign defaults.</w:t>
+        <w:t>In order to assess prediction consistency between models, a paired t test was conducted comparing hybrid and XGBoost predicted probabilities on overlapping sequence observations (n = 532). As illustrated in Figure 4.11, the paired t test yielded t = -0.33 with p = 0.743, indicating no statistically significant difference between the two models at conventional levels.</w:t>
+      </w:r>
+      <w:r>
+        <w:rPr>
+          <w:sz w:val="24"/>
+          <w:szCs w:val="24"/>
+          <w:rtl w:val="0"/>
+        </w:rPr>
+      </w:r>
+      <w:r>
+        <w:rPr>
+          <w:sz w:val="24"/>
+          <w:szCs w:val="24"/>
+          <w:rtl w:val="0"/>
+        </w:rPr>
+      </w:r>
+      <w:r>
+        <w:rPr>
+          <w:rtl w:val="0"/>
+        </w:rPr>
+      </w:r>
+    </w:p>
+    <w:p>
+      <w:pPr>
+        <w:spacing w:after="240" w:before="240" w:line="360" w:lineRule="auto"/>
+        <w:rPr>
+          <w:sz w:val="24"/>
+          <w:szCs w:val="24"/>
+        </w:rPr>
+      </w:pPr>
+      <w:r>
+        <w:rPr>
+          <w:sz w:val="24"/>
+          <w:szCs w:val="24"/>
+          <w:rtl w:val="0"/>
+        </w:rPr>
+        <w:t>Hybrid model accuracy on the country hold out test set was 86.5%, but this figure primarily reflects correct classification of the majority non default class under severe imbalance. Default class recall remained 15.6% at the F1 optimal threshold, underscoring that accuracy alone is an unreliable performance indicator.</w:t>
+      </w:r>
+    </w:p>
+    <w:p>
+      <w:pPr>
+        <w:spacing w:after="240" w:before="240" w:line="360" w:lineRule="auto"/>
+        <w:rPr>
+          <w:sz w:val="24"/>
+          <w:szCs w:val="24"/>
+        </w:rPr>
+      </w:pPr>
+      <w:r>
+        <w:rPr>
+          <w:sz w:val="24"/>
+          <w:szCs w:val="24"/>
+          <w:rtl w:val="0"/>
+        </w:rPr>
+        <w:t>Probability calibration remains imperfect for all models under severe class imbalance. High predicted probabilities for defaults are sparse, and threshold choice materially affects recall and precision. Results should therefore be interpreted using F1 score, recall, and PR AUC rather than accuracy or uncalibrated probability levels alone.</w:t>
+      </w:r>
+    </w:p>
+    <w:p>
+      <w:pPr>
+        <w:spacing w:after="240" w:before="240" w:line="360" w:lineRule="auto"/>
+        <w:rPr>
+          <w:sz w:val="24"/>
+          <w:szCs w:val="24"/>
+        </w:rPr>
+      </w:pPr>
+      <w:r>
+        <w:rPr>
+          <w:sz w:val="24"/>
+          <w:szCs w:val="24"/>
+          <w:rtl w:val="0"/>
+        </w:rPr>
+        <w:t>Probit regression serves as a transparent econometric baseline with 65.7% recall and ROC AUC of 0.563 on the country hold out set, but joint significance testing failed (pseudo R² = 0.009; LLR p = 0.725) and precision remained low (6.7%). Defaults represent approximately 5.4 per cent of country year observations in the full sample.</w:t>
       </w:r>
     </w:p>
     <w:p>
@@ -19452,7 +19446,7 @@
           <w:b w:val="1"/>
           <w:rtl w:val="0"/>
         </w:rPr>
-        <w:t>Section 4.6 summary: sovereign default prediction remains constrained by class imbalance and limited signal. The best country hold out F1 score was 0.122 (Hybrid (Attention LSTM + XGBoost)). Maximum recall reached 100.0% (Logistic Regression).</w:t>
+        <w:t>Section 4.6 summary: sovereign default prediction remains constrained by class imbalance and limited signal. The best country hold out F1 score was 0.122 (Hybrid (Attention LSTM + XGBoost)). Maximum recall reached 100.0% (Logistic Regression). Probit achieved the highest ROC AUC (0.56).</w:t>
       </w:r>
       <w:r>
         <w:rPr>
@@ -19693,7 +19687,7 @@
           <w:szCs w:val="24"/>
           <w:rtl w:val="0"/>
         </w:rPr>
-        <w:t>Machine learning models improve default recall and F1 relative to naive baselines, but ROC AUC (0.49 to 0.56) and PR AUC remain modest on the country hold out split. Hybrid (Attention LSTM + XGBoost) achieved the highest F1 (0.122); Logistic Regression achieved the highest recall (100.0%); the hybrid reached 15.6% recall with F1 of 0.122.</w:t>
+        <w:t>Machine learning models show mixed performance relative to econometric baselines. On the country hold out split, Hybrid (Attention LSTM + XGBoost) achieved the highest F1 (0.122), Hybrid (Attention LSTM + XGBoost) the highest PR AUC (0.081), and Probit the highest ROC AUC (0.56). The hybrid reached 15.6% recall with F1 of 0.122. ROC AUC (0.49 to 0.56) and PR AUC (0.059 to 0.081) remain modest.</w:t>
       </w:r>
     </w:p>
     <w:p>
@@ -19756,7 +19750,7 @@
           <w:szCs w:val="24"/>
           <w:rtl w:val="0"/>
         </w:rPr>
-        <w:t>The poor performance of the Probit regression model observed in this study reinforces the limitations of traditional econometric approaches in sovereign default prediction. Although historically prominent in early warning frameworks, the Probit model’s structure assumes linear relationships between predictors and the latent propensity to default. This rigid specification prevents it from capturing the nonlinear interactions and threshold effects characteristic of sovereign risk dynamics. Furthermore, the model generated a limited predictive signal when applied to this highly imbalanced dataset, with defaults comprising only 1.4% of observations, The models exhibited stable performance across cross validation folds, ROC AUC of approximately 0.52 and a F1 score near 0.10, near random classification levels. Importantly, while SHAP analysis provides valuable interpretability for machine learning models, it is not well suited for Probit regression, as SHAP explanations only approximate marginal contributions and lack full compatibility with the model’s underlying statistical structure. For Probit, marginal effects are better derived directly from the model’s estimated coefficients. These results underscore both the methodological and practical reasons why Probit underperformed and why more flexible machine learning approaches, complemented by SHAP interpretability, are better equipped to handle modern sovereign risk forecasting challenges.</w:t>
+        <w:t>Probit regression remains interpretable but shows weak joint explanatory power (pseudo R² ≈ 0.009; LLR p = 0.725). On the country hold out split it achieved recall of 65.7% and F1 of 0.121, outperforming the hybrid on recall and ROC AUC but not on default class F1 or PR AUC. Its linear structure limits capture of nonlinear interactions, yet it remains a valuable transparent benchmark. SHAP is better applied to tree models; Probit interpretation relies on estimated marginal effects.</w:t>
       </w:r>
     </w:p>
     <w:p>
@@ -19929,7 +19923,7 @@
           <w:szCs w:val="24"/>
           <w:rtl w:val="0"/>
         </w:rPr>
-        <w:t>Probit regression achieved 65.7% recall on the country hold out split but low precision and failed joint significance testing (pseudo R² ≈ 0.009; LLR p = 0.725).</w:t>
+        <w:t>Probit regression achieved 65.7% recall on the country hold out split but low precision (6.7%) and failed joint significance testing (pseudo R² ≈ 0.009; LLR p = 0.725).</w:t>
       </w:r>
       <w:r>
         <w:rPr>
@@ -20288,7 +20282,7 @@
           <w:szCs w:val="24"/>
           <w:rtl w:val="0"/>
         </w:rPr>
-        <w:t xml:space="preserve">Despite these contributions, this research is not without limitations. A major limitation concerns data quality and availability. Many low income countries had incomplete reporting histories, leading to their exclusion and introducing potential selection bias. Although SMOTE and stratified cross validation were used to mitigate class imbalance , sovereign defaults accounted for just 1.4% of observations. Rare event prediction remains inherently difficult, as reflected in moderate recall rates for defaults. Furthermore, while SHAP improves transparency, some internal feature representations of the LSTM remain obscure and difficult to interpret intuitively.</w:t>
+        <w:t>Despite these contributions, this research is not without limitations. A major limitation concerns data quality and availability. Many low income countries had incomplete reporting histories, leading to their exclusion and introducing potential selection bias. Although SMOTE and country hold out validation were used to mitigate class imbalance, sovereign defaults accounted for approximately 5.4 per cent of observations. Rare event prediction remains inherently difficult, as reflected in moderate default recall rates. Furthermore, while SHAP improves transparency for tree models, LSTM attention embeddings remain less directly interpretable for policymakers.</w:t>
       </w:r>
     </w:p>
     <w:p>

</xml_diff>